<commit_message>
Atualizar relatorio e partilhar modelos treinados
</commit_message>
<xml_diff>
--- a/relatorio_e_comandos_ia.docx
+++ b/relatorio_e_comandos_ia.docx
@@ -14,18 +14,6 @@
         </w:rPr>
         <w:t>Para o relatorio:</w:t>
       </w:r>
-      <w:r>
-        <w:rPr>
-          <w:lang w:val="pt-BR"/>
-        </w:rPr>
-        <w:br/>
-      </w:r>
-      <w:r>
-        <w:rPr>
-          <w:lang w:val="pt-BR"/>
-        </w:rPr>
-        <w:t># Texto para adaptar ao capítulo 1 do relatório</w:t>
-      </w:r>
     </w:p>
     <w:p>
       <w:pPr>
@@ -331,20 +319,20 @@
         <w:rPr>
           <w:lang w:val="pt-BR"/>
         </w:rPr>
+        <w:t>etiquetas provêm dos metadados e não substituem uma inspeção visual. As cinco</w:t>
+      </w:r>
+    </w:p>
+    <w:p>
+      <w:pPr>
+        <w:rPr>
+          <w:lang w:val="pt-BR"/>
+        </w:rPr>
+      </w:pPr>
+      <w:r>
+        <w:rPr>
+          <w:lang w:val="pt-BR"/>
+        </w:rPr>
         <w:lastRenderedPageBreak/>
-        <w:t>etiquetas provêm dos metadados e não substituem uma inspeção visual. As cinco</w:t>
-      </w:r>
-    </w:p>
-    <w:p>
-      <w:pPr>
-        <w:rPr>
-          <w:lang w:val="pt-BR"/>
-        </w:rPr>
-      </w:pPr>
-      <w:r>
-        <w:rPr>
-          <w:lang w:val="pt-BR"/>
-        </w:rPr>
         <w:t>classes estão equilibradas em número de imagens, mas os tipos de fotografias</w:t>
       </w:r>
     </w:p>
@@ -585,19 +573,7 @@
         <w:rPr>
           <w:lang w:val="pt-BR"/>
         </w:rPr>
-        <w:br/>
-      </w:r>
-      <w:r>
-        <w:rPr>
-          <w:lang w:val="pt-BR"/>
-        </w:rPr>
-        <w:br/>
-      </w:r>
-      <w:r>
-        <w:rPr>
-          <w:lang w:val="pt-BR"/>
-        </w:rPr>
-        <w:br/>
+        <w:t>Durante os treinos, o TensorFlow apresentou repetidamente um aviso sobre bytes extra num JPEG. O aviso não interrompeu a leitura nem o treino e poderá corresponder ao mesmo ficheiro encontrado em cada época. O dataset foi mantido igual nas três experiências para permitir uma comparação justa; os históricos serão analisados após a conclusão dos treinos.</w:t>
       </w:r>
       <w:r>
         <w:rPr>
@@ -634,6 +610,13 @@
           <w:lang w:val="pt-BR"/>
         </w:rPr>
         <w:lastRenderedPageBreak/>
+        <w:br/>
+      </w:r>
+      <w:r>
+        <w:rPr>
+          <w:lang w:val="pt-BR"/>
+        </w:rPr>
+        <w:br/>
         <w:t>Para o ficheiro dos comandos IA</w:t>
       </w:r>
       <w:r>
@@ -652,6 +635,105 @@
         <w:rPr>
           <w:lang w:val="pt-BR"/>
         </w:rPr>
+        <w:t>A resolução do trabalho prático é divido em metas:</w:t>
+      </w:r>
+      <w:r>
+        <w:rPr>
+          <w:lang w:val="pt-BR"/>
+        </w:rPr>
+        <w:br/>
+        <w:t>1.Definir o problema e preparar o dataset</w:t>
+      </w:r>
+      <w:r>
+        <w:rPr>
+          <w:lang w:val="pt-BR"/>
+        </w:rPr>
+        <w:br/>
+        <w:t>Fechar o objetivo do HikeFlora, escolher as espécies e as imagens, caracterizar os dados e deixá-los separados em treino, validação e teste.</w:t>
+      </w:r>
+    </w:p>
+    <w:p>
+      <w:pPr>
+        <w:rPr>
+          <w:lang w:val="pt-BR"/>
+        </w:rPr>
+      </w:pPr>
+      <w:r>
+        <w:rPr>
+          <w:lang w:val="pt-BR"/>
+        </w:rPr>
+        <w:t>2.Desenvolver e treinar os classificadores</w:t>
+      </w:r>
+      <w:r>
+        <w:rPr>
+          <w:lang w:val="pt-BR"/>
+        </w:rPr>
+        <w:br/>
+        <w:t>Implementar em Python diferentes soluções baseadas em MLP ou CNN, documentando as arquiteturas e os parâmetros utilizados.</w:t>
+      </w:r>
+    </w:p>
+    <w:p>
+      <w:pPr>
+        <w:rPr>
+          <w:lang w:val="pt-BR"/>
+        </w:rPr>
+      </w:pPr>
+      <w:r>
+        <w:rPr>
+          <w:lang w:val="pt-BR"/>
+        </w:rPr>
+        <w:t>3.Avaliar e comparar os resultados</w:t>
+      </w:r>
+      <w:r>
+        <w:rPr>
+          <w:lang w:val="pt-BR"/>
+        </w:rPr>
+        <w:br/>
+        <w:t>Usar o teste independente, calcular accuracy, recall, especificidade, F1, AUC e matriz de confusão, e explicar as vantagens, limitações e erros dos modelos.</w:t>
+      </w:r>
+    </w:p>
+    <w:p>
+      <w:pPr>
+        <w:rPr>
+          <w:lang w:val="pt-BR"/>
+        </w:rPr>
+      </w:pPr>
+      <w:r>
+        <w:rPr>
+          <w:lang w:val="pt-BR"/>
+        </w:rPr>
+        <w:t>4.Preparar a entrega e a apresentação</w:t>
+      </w:r>
+      <w:r>
+        <w:rPr>
+          <w:lang w:val="pt-BR"/>
+        </w:rPr>
+        <w:br/>
+        <w:t>Consolidar o relatório de até 10 páginas, organizar o código e preparar os slides para a defesa.</w:t>
+      </w:r>
+    </w:p>
+    <w:p>
+      <w:pPr>
+        <w:rPr>
+          <w:lang w:val="pt-BR"/>
+        </w:rPr>
+      </w:pPr>
+      <w:r>
+        <w:rPr>
+          <w:lang w:val="pt-BR"/>
+        </w:rPr>
+        <w:br/>
+      </w:r>
+      <w:r>
+        <w:rPr>
+          <w:lang w:val="pt-BR"/>
+        </w:rPr>
+        <w:br/>
+      </w:r>
+      <w:r>
+        <w:rPr>
+          <w:lang w:val="pt-BR"/>
+        </w:rPr>
         <w:t>PROMPT // RESPOSTA IA (VERSÃO RESUMIDA) // MINHA ANALISE // RESULTADO</w:t>
       </w:r>
       <w:r>
@@ -659,12 +741,37 @@
           <w:lang w:val="pt-BR"/>
         </w:rPr>
         <w:br/>
+      </w:r>
+      <w:r>
+        <w:rPr>
+          <w:sz w:val="72"/>
+          <w:szCs w:val="72"/>
+          <w:lang w:val="pt-BR"/>
+        </w:rPr>
         <w:t>Tarefa 1</w:t>
       </w:r>
       <w:r>
         <w:rPr>
           <w:lang w:val="pt-BR"/>
         </w:rPr>
+        <w:t xml:space="preserve"> – FALTA A MINHA A</w:t>
+      </w:r>
+      <w:r>
+        <w:rPr>
+          <w:lang w:val="pt-BR"/>
+        </w:rPr>
+        <w:t>na</w:t>
+      </w:r>
+      <w:r>
+        <w:rPr>
+          <w:lang w:val="pt-BR"/>
+        </w:rPr>
+        <w:t>LISE E O RESULTADO</w:t>
+      </w:r>
+      <w:r>
+        <w:rPr>
+          <w:lang w:val="pt-BR"/>
+        </w:rPr>
         <w:br/>
       </w:r>
       <w:r>
@@ -738,6 +845,12 @@
           <w:lang w:val="pt-BR"/>
         </w:rPr>
         <w:br/>
+      </w:r>
+      <w:r>
+        <w:rPr>
+          <w:lang w:val="pt-BR"/>
+        </w:rPr>
+        <w:lastRenderedPageBreak/>
         <w:t>Fechar o objetivo do HikeFlora, escolher as espécies e as imagens, caracterizar os dados e deixá-los separados em treino, validação e teste.</w:t>
       </w:r>
     </w:p>
@@ -839,12 +952,6 @@
           <w:lang w:val="pt-BR"/>
         </w:rPr>
         <w:br/>
-      </w:r>
-      <w:r>
-        <w:rPr>
-          <w:lang w:val="pt-BR"/>
-        </w:rPr>
-        <w:lastRenderedPageBreak/>
         <w:t>A submissao do trabalho deve ter:</w:t>
       </w:r>
       <w:r>
@@ -965,6 +1072,7 @@
         <w:rPr>
           <w:lang w:val="pt-BR"/>
         </w:rPr>
+        <w:lastRenderedPageBreak/>
         <w:br/>
         <w:t>Resposta IA:</w:t>
       </w:r>
@@ -1059,7 +1167,6 @@
         <w:rPr>
           <w:noProof/>
         </w:rPr>
-        <w:lastRenderedPageBreak/>
         <w:drawing>
           <wp:inline distT="0" distB="0" distL="0" distR="0" wp14:anchorId="2B7B2019" wp14:editId="7D84CD26">
             <wp:extent cx="5943600" cy="3049905"/>
@@ -1119,7 +1226,1046 @@
         <w:rPr>
           <w:lang w:val="pt-BR"/>
         </w:rPr>
-        <w:t>Confirmei pela saída do verificador que as 11 000 imagens foram extraídas e abertas com sucesso, sem ficheiros em falta. As cinco classes têm divisões iguais de treino, validação e teste. Revi ainda uma amostra visual de 75 fotografias e preparei a descrição do dataset para o relatório.</w:t>
+        <w:t xml:space="preserve">Confirmei pela saída do verificador que as 11 000 imagens foram extraídas e abertas com sucesso, sem ficheiros em falta. As cinco classes têm divisões iguais de treino, validação e </w:t>
+      </w:r>
+      <w:r>
+        <w:rPr>
+          <w:lang w:val="pt-BR"/>
+        </w:rPr>
+        <w:lastRenderedPageBreak/>
+        <w:t>teste. Revi ainda uma amostra visual de 75 fotografias e preparei a descrição do dataset para o relatório.</w:t>
+      </w:r>
+    </w:p>
+    <w:p>
+      <w:pPr>
+        <w:rPr>
+          <w:lang w:val="pt-BR"/>
+        </w:rPr>
+      </w:pPr>
+    </w:p>
+    <w:p>
+      <w:pPr>
+        <w:rPr>
+          <w:lang w:val="pt-BR"/>
+        </w:rPr>
+      </w:pPr>
+      <w:r>
+        <w:rPr>
+          <w:sz w:val="72"/>
+          <w:szCs w:val="72"/>
+          <w:lang w:val="pt-BR"/>
+        </w:rPr>
+        <w:t>Tarefa 2</w:t>
+      </w:r>
+    </w:p>
+    <w:p>
+      <w:pPr>
+        <w:rPr>
+          <w:lang w:val="pt-BR"/>
+        </w:rPr>
+      </w:pPr>
+      <w:r>
+        <w:rPr>
+          <w:lang w:val="pt-BR"/>
+        </w:rPr>
+        <w:t>PROMPT 1:</w:t>
+      </w:r>
+    </w:p>
+    <w:p>
+      <w:pPr>
+        <w:rPr>
+          <w:lang w:val="pt-BR"/>
+        </w:rPr>
+      </w:pPr>
+      <w:r>
+        <w:rPr>
+          <w:lang w:val="pt-BR"/>
+        </w:rPr>
+        <w:t>Agora eu quero iniciar a parte 2. Releia o enunciado e vamos fazer a parte 2:</w:t>
+      </w:r>
+      <w:r>
+        <w:rPr>
+          <w:lang w:val="pt-BR"/>
+        </w:rPr>
+        <w:br/>
+        <w:t>Desenvolver e treinar os classificadores</w:t>
+      </w:r>
+      <w:r>
+        <w:rPr>
+          <w:lang w:val="pt-BR"/>
+        </w:rPr>
+        <w:br/>
+        <w:t>Implementar em Python diferentes soluções baseadas em MLP ou CNN, documentando as arquiteturas e os parâmetros utilizados.</w:t>
+      </w:r>
+    </w:p>
+    <w:p>
+      <w:pPr>
+        <w:rPr>
+          <w:lang w:val="pt-BR"/>
+        </w:rPr>
+      </w:pPr>
+      <w:r>
+        <w:rPr>
+          <w:lang w:val="pt-BR"/>
+        </w:rPr>
+        <w:t>Agora a parte de resposta IAG devem ser mais contextualizada.</w:t>
+      </w:r>
+    </w:p>
+    <w:p>
+      <w:pPr>
+        <w:rPr>
+          <w:lang w:val="pt-BR"/>
+        </w:rPr>
+      </w:pPr>
+      <w:r>
+        <w:rPr>
+          <w:lang w:val="pt-BR"/>
+        </w:rPr>
+        <w:t>Relembre se também de utilizar o codigo py simples e facil de entender, sem incluir codigo a mais e desnecessario. O codigo deve ter pequenos comentarios para definir o que cada parte do codigo faz.</w:t>
+      </w:r>
+    </w:p>
+    <w:p>
+      <w:pPr>
+        <w:rPr>
+          <w:lang w:val="pt-BR"/>
+        </w:rPr>
+      </w:pPr>
+      <w:r>
+        <w:rPr>
+          <w:lang w:val="pt-BR"/>
+        </w:rPr>
+        <w:t>Resposta IA:</w:t>
+      </w:r>
+    </w:p>
+    <w:p>
+      <w:pPr>
+        <w:rPr>
+          <w:lang w:val="pt-BR"/>
+        </w:rPr>
+      </w:pPr>
+      <w:r>
+        <w:rPr>
+          <w:lang w:val="pt-BR"/>
+        </w:rPr>
+        <w:t>Após reler o enunciado, preparei duas soluções iniciais para as cinco espécies do HikeFlora: uma MLP e uma CNN. Ambas usam imagens RGB de 128 × 128, 10 épocas, batches de 32, Adam com taxa de aprendizagem 0,001 e a mesma divisão de treino e validação. O código guarda os modelos e as métricas por época, mantendo o teste independente reservado para a avaliação posterior. As arquiteturas foram documentadas e o código passou num teste de execução com uma pequena amostra; o treino completo ainda está pendente.</w:t>
+      </w:r>
+      <w:r>
+        <w:rPr>
+          <w:lang w:val="pt-BR"/>
+        </w:rPr>
+        <w:br/>
+      </w:r>
+      <w:r>
+        <w:rPr>
+          <w:lang w:val="pt-BR"/>
+        </w:rPr>
+        <w:br/>
+      </w:r>
+      <w:r>
+        <w:rPr>
+          <w:lang w:val="pt-BR"/>
+        </w:rPr>
+        <w:t>Prompt 2:</w:t>
+      </w:r>
+      <w:r>
+        <w:rPr>
+          <w:lang w:val="pt-BR"/>
+        </w:rPr>
+        <w:br/>
+      </w:r>
+      <w:r>
+        <w:rPr>
+          <w:lang w:val="pt-BR"/>
+        </w:rPr>
+        <w:t>Os resultados foram estes.</w:t>
+      </w:r>
+      <w:r>
+        <w:rPr>
+          <w:lang w:val="pt-BR"/>
+        </w:rPr>
+        <w:t xml:space="preserve"> </w:t>
+      </w:r>
+      <w:r>
+        <w:rPr>
+          <w:noProof/>
+        </w:rPr>
+        <w:drawing>
+          <wp:inline distT="0" distB="0" distL="0" distR="0" wp14:anchorId="2CBAA8F4" wp14:editId="0FF052F0">
+            <wp:extent cx="2980952" cy="1895238"/>
+            <wp:effectExtent l="0" t="0" r="0" b="0"/>
+            <wp:docPr id="461880855" name="Picture 1"/>
+            <wp:cNvGraphicFramePr>
+              <a:graphicFrameLocks xmlns:a="http://schemas.openxmlformats.org/drawingml/2006/main" noChangeAspect="1"/>
+            </wp:cNvGraphicFramePr>
+            <a:graphic xmlns:a="http://schemas.openxmlformats.org/drawingml/2006/main">
+              <a:graphicData uri="http://schemas.openxmlformats.org/drawingml/2006/picture">
+                <pic:pic xmlns:pic="http://schemas.openxmlformats.org/drawingml/2006/picture">
+                  <pic:nvPicPr>
+                    <pic:cNvPr id="461880855" name=""/>
+                    <pic:cNvPicPr/>
+                  </pic:nvPicPr>
+                  <pic:blipFill>
+                    <a:blip r:embed="rId6"/>
+                    <a:stretch>
+                      <a:fillRect/>
+                    </a:stretch>
+                  </pic:blipFill>
+                  <pic:spPr>
+                    <a:xfrm>
+                      <a:off x="0" y="0"/>
+                      <a:ext cx="2980952" cy="1895238"/>
+                    </a:xfrm>
+                    <a:prstGeom prst="rect">
+                      <a:avLst/>
+                    </a:prstGeom>
+                  </pic:spPr>
+                </pic:pic>
+              </a:graphicData>
+            </a:graphic>
+          </wp:inline>
+        </w:drawing>
+      </w:r>
+      <w:r>
+        <w:rPr>
+          <w:lang w:val="pt-BR"/>
+        </w:rPr>
+        <w:t xml:space="preserve"> Isto ja faz parte </w:t>
+      </w:r>
+      <w:r>
+        <w:rPr>
+          <w:lang w:val="pt-BR"/>
+        </w:rPr>
+        <w:lastRenderedPageBreak/>
+        <w:t>da meta 3? Outra questao, no enunciado diz: Definição da arquitetura do modelo, incluindo o número de camadas, o número de</w:t>
+      </w:r>
+      <w:r>
+        <w:rPr>
+          <w:lang w:val="pt-BR"/>
+        </w:rPr>
+        <w:br/>
+        <w:t>neurónios por camada, as funções de ativação, o algoritmo de treino, a taxa de</w:t>
+      </w:r>
+      <w:r>
+        <w:rPr>
+          <w:lang w:val="pt-BR"/>
+        </w:rPr>
+        <w:br/>
+        <w:t>aprendizagem e outros parâmetros relevantes;</w:t>
+      </w:r>
+      <w:r>
+        <w:rPr>
+          <w:lang w:val="pt-BR"/>
+        </w:rPr>
+        <w:br/>
+      </w:r>
+      <w:r>
+        <w:sym w:font="Symbol" w:char="F0B7"/>
+      </w:r>
+      <w:r>
+        <w:rPr>
+          <w:lang w:val="pt-BR"/>
+        </w:rPr>
+        <w:t xml:space="preserve"> Treino do modelo com recurso ao conjunto de dados de treino;</w:t>
+      </w:r>
+      <w:r>
+        <w:rPr>
+          <w:lang w:val="pt-BR"/>
+        </w:rPr>
+        <w:br/>
+      </w:r>
+      <w:r>
+        <w:sym w:font="Symbol" w:char="F0B7"/>
+      </w:r>
+      <w:r>
+        <w:rPr>
+          <w:lang w:val="pt-BR"/>
+        </w:rPr>
+        <w:t xml:space="preserve"> Teste e avaliação do modelo, recorrendo a um conjunto de teste independente, de forma</w:t>
+      </w:r>
+      <w:r>
+        <w:rPr>
+          <w:lang w:val="pt-BR"/>
+        </w:rPr>
+        <w:br/>
+        <w:t>a avaliar o seu desempenho e capacidade de generalização.</w:t>
+      </w:r>
+    </w:p>
+    <w:p>
+      <w:pPr>
+        <w:rPr>
+          <w:lang w:val="pt-BR"/>
+        </w:rPr>
+      </w:pPr>
+      <w:r>
+        <w:rPr>
+          <w:lang w:val="pt-BR"/>
+        </w:rPr>
+        <w:t>Eu ja fiz isso? E se sim, em que meta e aonde isto está apontado?</w:t>
+      </w:r>
+    </w:p>
+    <w:p>
+      <w:pPr>
+        <w:rPr>
+          <w:lang w:val="pt-BR"/>
+        </w:rPr>
+      </w:pPr>
+      <w:r>
+        <w:rPr>
+          <w:lang w:val="pt-BR"/>
+        </w:rPr>
+        <w:t>Resposta:</w:t>
+      </w:r>
+      <w:r>
+        <w:rPr>
+          <w:lang w:val="pt-BR"/>
+        </w:rPr>
+        <w:br/>
+      </w:r>
+      <w:r>
+        <w:rPr>
+          <w:lang w:val="pt-BR"/>
+        </w:rPr>
+        <w:t>Foram analisados os históricos de 10 épocas dos classificadores MLP e CNN do HikeFlora. A implementação e o treino exigidos pelo enunciado já foram realizados e documentados no código e no ficheiro de arquiteturas. A CNN apresentou melhor resultado de validação, atingindo 72,09%, mas a diferença entre treino e validação no final sugere sobreajuste. Estes resultados ainda não substituem a avaliação independente: falta executar os modelos sobre o conjunto de teste e calcular as métricas e a matriz de confusão exigidas</w:t>
+      </w:r>
+      <w:r>
+        <w:rPr>
+          <w:lang w:val="pt-BR"/>
+        </w:rPr>
+        <w:t>.</w:t>
+      </w:r>
+      <w:r>
+        <w:rPr>
+          <w:lang w:val="pt-BR"/>
+        </w:rPr>
+        <w:br/>
+      </w:r>
+      <w:r>
+        <w:rPr>
+          <w:lang w:val="pt-BR"/>
+        </w:rPr>
+        <w:br/>
+        <w:t xml:space="preserve">Prompt 3: </w:t>
+      </w:r>
+      <w:r>
+        <w:rPr>
+          <w:lang w:val="pt-BR"/>
+        </w:rPr>
+        <w:t>Ok, entao o que falta da tarefa 2? Já foi tudo? Posso passar pra tarefa 3?</w:t>
+      </w:r>
+    </w:p>
+    <w:p>
+      <w:pPr>
+        <w:rPr>
+          <w:lang w:val="pt-BR"/>
+        </w:rPr>
+      </w:pPr>
+      <w:r>
+        <w:rPr>
+          <w:lang w:val="pt-BR"/>
+        </w:rPr>
+        <w:br/>
+        <w:t>Resposta:</w:t>
+      </w:r>
+      <w:r>
+        <w:rPr>
+          <w:lang w:val="pt-BR"/>
+        </w:rPr>
+        <w:br/>
+      </w:r>
+      <w:r>
+        <w:rPr>
+          <w:lang w:val="pt-BR"/>
+        </w:rPr>
+        <w:br/>
+      </w:r>
+      <w:r>
+        <w:rPr>
+          <w:lang w:val="pt-BR"/>
+        </w:rPr>
+        <w:t>Os históricos enviados confirmam que a MLP e a CNN foram treinadas durante 10 épocas, cumprindo o desenvolvimento e treino previstos na tarefa 2. As arquiteturas e os parâmetros estão documentados no projeto. A análise da validação revelou possível sobreajuste na CNN, que deverá ser discutido na comparação dos modelos. O passo seguinte é a tarefa 3: avaliar ambos os modelos no conjunto de teste independente e calcular as métricas exigidas</w:t>
+      </w:r>
+    </w:p>
+    <w:p>
+      <w:pPr>
+        <w:rPr>
+          <w:lang w:val="pt-BR"/>
+        </w:rPr>
+      </w:pPr>
+      <w:r>
+        <w:rPr>
+          <w:lang w:val="pt-BR"/>
+        </w:rPr>
+        <w:br/>
+      </w:r>
+    </w:p>
+    <w:p>
+      <w:pPr>
+        <w:rPr>
+          <w:sz w:val="72"/>
+          <w:szCs w:val="72"/>
+          <w:lang w:val="pt-BR"/>
+        </w:rPr>
+      </w:pPr>
+      <w:r>
+        <w:rPr>
+          <w:sz w:val="72"/>
+          <w:szCs w:val="72"/>
+          <w:lang w:val="pt-BR"/>
+        </w:rPr>
+        <w:t>Tarefa 3</w:t>
+      </w:r>
+    </w:p>
+    <w:p>
+      <w:pPr>
+        <w:rPr>
+          <w:lang w:val="pt-BR"/>
+        </w:rPr>
+      </w:pPr>
+      <w:r>
+        <w:rPr>
+          <w:lang w:val="pt-BR"/>
+        </w:rPr>
+        <w:t>Prompt 1:</w:t>
+      </w:r>
+      <w:r>
+        <w:rPr>
+          <w:lang w:val="pt-BR"/>
+        </w:rPr>
+        <w:br/>
+      </w:r>
+      <w:r>
+        <w:rPr>
+          <w:lang w:val="pt-BR"/>
+        </w:rPr>
+        <w:t xml:space="preserve">Ok, vamos fazer então agora a meta 3. Como a meta 2 mostrou, é preciso alguns ajustes no modelo, então eu quero que voce primeiro de tudo me sugira pelo menos 3 tipos </w:t>
+      </w:r>
+      <w:r>
+        <w:rPr>
+          <w:lang w:val="pt-BR"/>
+        </w:rPr>
+        <w:lastRenderedPageBreak/>
+        <w:t>configuração de treino diferentes para eu testar e escolher a melhor. Me diga tambem o que devo mudar e onde e como testar.</w:t>
+      </w:r>
+    </w:p>
+    <w:p>
+      <w:pPr>
+        <w:rPr>
+          <w:lang w:val="pt-BR"/>
+        </w:rPr>
+      </w:pPr>
+      <w:r>
+        <w:rPr>
+          <w:lang w:val="pt-BR"/>
+        </w:rPr>
+        <w:t>Resposta</w:t>
+      </w:r>
+      <w:r>
+        <w:rPr>
+          <w:lang w:val="pt-BR"/>
+        </w:rPr>
+        <w:t>:</w:t>
+      </w:r>
+      <w:r>
+        <w:rPr>
+          <w:lang w:val="pt-BR"/>
+        </w:rPr>
+        <w:br/>
+      </w:r>
+      <w:r>
+        <w:rPr>
+          <w:lang w:val="pt-BR"/>
+        </w:rPr>
+        <w:t>A análise dos históricos mostrou sinais de sobreajuste na CNN: a accuracy de treino continuou a subir enquanto a perda de validação piorou. Foram propostas três experiências progressivas — paragem baseada na validação, adição de dropout e adição de pequenas variações às imagens de treino — mantendo os restantes parâmetros comparáveis. Os modelos serão escolhidos pelos resultados de validação; o conjunto de teste permanecerá reservado para a avaliação independente da solução escolhida e da MLP.</w:t>
+      </w:r>
+      <w:r>
+        <w:rPr>
+          <w:lang w:val="pt-BR"/>
+        </w:rPr>
+        <w:br/>
+      </w:r>
+      <w:r>
+        <w:rPr>
+          <w:lang w:val="pt-BR"/>
+        </w:rPr>
+        <w:br/>
+        <w:t>prompt:</w:t>
+      </w:r>
+      <w:r>
+        <w:rPr>
+          <w:lang w:val="pt-BR"/>
+        </w:rPr>
+        <w:br/>
+      </w:r>
+      <w:r>
+        <w:rPr>
+          <w:noProof/>
+        </w:rPr>
+        <w:drawing>
+          <wp:inline distT="0" distB="0" distL="0" distR="0" wp14:anchorId="1BBE5167" wp14:editId="6F4593A3">
+            <wp:extent cx="3523809" cy="3676190"/>
+            <wp:effectExtent l="0" t="0" r="635" b="635"/>
+            <wp:docPr id="134434683" name="Picture 1"/>
+            <wp:cNvGraphicFramePr>
+              <a:graphicFrameLocks xmlns:a="http://schemas.openxmlformats.org/drawingml/2006/main" noChangeAspect="1"/>
+            </wp:cNvGraphicFramePr>
+            <a:graphic xmlns:a="http://schemas.openxmlformats.org/drawingml/2006/main">
+              <a:graphicData uri="http://schemas.openxmlformats.org/drawingml/2006/picture">
+                <pic:pic xmlns:pic="http://schemas.openxmlformats.org/drawingml/2006/picture">
+                  <pic:nvPicPr>
+                    <pic:cNvPr id="134434683" name=""/>
+                    <pic:cNvPicPr/>
+                  </pic:nvPicPr>
+                  <pic:blipFill>
+                    <a:blip r:embed="rId7"/>
+                    <a:stretch>
+                      <a:fillRect/>
+                    </a:stretch>
+                  </pic:blipFill>
+                  <pic:spPr>
+                    <a:xfrm>
+                      <a:off x="0" y="0"/>
+                      <a:ext cx="3523809" cy="3676190"/>
+                    </a:xfrm>
+                    <a:prstGeom prst="rect">
+                      <a:avLst/>
+                    </a:prstGeom>
+                  </pic:spPr>
+                </pic:pic>
+              </a:graphicData>
+            </a:graphic>
+          </wp:inline>
+        </w:drawing>
+      </w:r>
+    </w:p>
+    <w:p>
+      <w:pPr>
+        <w:rPr>
+          <w:lang w:val="pt-BR"/>
+        </w:rPr>
+      </w:pPr>
+    </w:p>
+    <w:p>
+      <w:pPr>
+        <w:rPr>
+          <w:lang w:val="pt-BR"/>
+        </w:rPr>
+      </w:pPr>
+      <w:r>
+        <w:rPr>
+          <w:lang w:val="pt-BR"/>
+        </w:rPr>
+        <w:t>Resposta:</w:t>
+      </w:r>
+      <w:r>
+        <w:rPr>
+          <w:lang w:val="pt-BR"/>
+        </w:rPr>
+        <w:br/>
+      </w:r>
+      <w:r>
+        <w:rPr>
+          <w:lang w:val="pt-BR"/>
+        </w:rPr>
+        <w:t xml:space="preserve">Foram comparados os históricos de validação de três variações da CNN, segundo o critério previamente definido de menor perda de validação. A configuração com dropout obteve o melhor valor, 0,7386, com 72,18% de accuracy na época guardada. Foi selecionada para a avaliação independente, em comparação com a MLP já treinada. O conjunto de teste ainda não foi utilizado; nele serão calculadas as métricas e as matrizes </w:t>
+      </w:r>
+      <w:r>
+        <w:rPr>
+          <w:lang w:val="pt-BR"/>
+        </w:rPr>
+        <w:lastRenderedPageBreak/>
+        <w:t>de confusão exigidas pelo enunciado.</w:t>
+      </w:r>
+      <w:r>
+        <w:rPr>
+          <w:lang w:val="pt-BR"/>
+        </w:rPr>
+        <w:br/>
+      </w:r>
+      <w:r>
+        <w:rPr>
+          <w:lang w:val="pt-BR"/>
+        </w:rPr>
+        <w:br/>
+        <w:t>Prompt:</w:t>
+      </w:r>
+      <w:r>
+        <w:rPr>
+          <w:rFonts w:ascii="Times New Roman" w:eastAsia="Times New Roman" w:hAnsi="Times New Roman" w:cs="Times New Roman"/>
+          <w:kern w:val="0"/>
+          <w:lang w:val="pt-BR"/>
+          <w14:ligatures w14:val="none"/>
+        </w:rPr>
+        <w:t xml:space="preserve"> </w:t>
+      </w:r>
+      <w:r>
+        <w:rPr>
+          <w:lang w:val="pt-BR"/>
+        </w:rPr>
+        <w:t>Esses novos ficheiros que voce também ja fez foram pra fazer os objetivos da fase 3. Se sim pode dar sim push para o git para eu dar pull e depois me diga o que devo fazer</w:t>
+      </w:r>
+    </w:p>
+    <w:p>
+      <w:r>
+        <w:rPr>
+          <w:lang w:val="pt-BR"/>
+        </w:rPr>
+        <w:br/>
+        <w:t>Resposta:</w:t>
+      </w:r>
+      <w:r>
+        <w:rPr>
+          <w:lang w:val="pt-BR"/>
+        </w:rPr>
+        <w:br/>
+      </w:r>
+      <w:r>
+        <w:rPr>
+          <w:lang w:val="pt-BR"/>
+        </w:rPr>
+        <w:t>Depois de selecionar a CNN com dropout pelos resultados de validação, foi acrescentado um script para avaliar essa CNN e a MLP no conjunto de teste independente. O script calcula accuracy, recall, especificidade, F1 e AUC, apresenta valores por espécie e as matrizes de confusão, e guarda tudo num ficheiro de texto. A avaliação completa e a discussão dos resultados dependem da execução no computador que contém as imagens e os modelos treinados.</w:t>
+      </w:r>
+      <w:r>
+        <w:rPr>
+          <w:lang w:val="pt-BR"/>
+        </w:rPr>
+        <w:br/>
+      </w:r>
+      <w:r>
+        <w:rPr>
+          <w:lang w:val="pt-BR"/>
+        </w:rPr>
+        <w:br/>
+      </w:r>
+      <w:r>
+        <w:t>prompt:</w:t>
+      </w:r>
+      <w:r>
+        <w:br/>
+      </w:r>
+      <w:r>
+        <w:t xml:space="preserve">PS C:\Users\gianc\Documents\faculdade\ic\HikeFlora&gt; &amp; "Env: </w:t>
+      </w:r>
+      <w:proofErr w:type="spellStart"/>
+      <w:r>
+        <w:t>Userprofile</w:t>
+      </w:r>
+      <w:proofErr w:type="spellEnd"/>
+      <w:r>
+        <w:t>\</w:t>
+      </w:r>
+      <w:proofErr w:type="spellStart"/>
+      <w:r>
+        <w:t>hfvenv</w:t>
+      </w:r>
+      <w:proofErr w:type="spellEnd"/>
+      <w:r>
+        <w:t>\Scripts\python.exe" avaliar_teste.py</w:t>
+      </w:r>
+      <w:r>
+        <w:br/>
+        <w:t xml:space="preserve">WARNING: All log messages before </w:t>
+      </w:r>
+      <w:proofErr w:type="spellStart"/>
+      <w:proofErr w:type="gramStart"/>
+      <w:r>
+        <w:t>absl</w:t>
+      </w:r>
+      <w:proofErr w:type="spellEnd"/>
+      <w:r>
+        <w:t>::</w:t>
+      </w:r>
+      <w:proofErr w:type="spellStart"/>
+      <w:r>
+        <w:t>InitializeLog</w:t>
+      </w:r>
+      <w:proofErr w:type="spellEnd"/>
+      <w:r>
+        <w:t>(</w:t>
+      </w:r>
+      <w:proofErr w:type="gramEnd"/>
+      <w:r>
+        <w:t>) is called are written to STDERR</w:t>
+      </w:r>
+      <w:r>
+        <w:br/>
+        <w:t xml:space="preserve">I0000 00:00:1791603414.551486 13052 port.cc:153] </w:t>
+      </w:r>
+      <w:proofErr w:type="spellStart"/>
+      <w:r>
+        <w:t>oneDNN</w:t>
+      </w:r>
+      <w:proofErr w:type="spellEnd"/>
+      <w:r>
+        <w:t xml:space="preserve"> custom operations are on. You may see slightly different numerical results due to floating-point round-off errors from different computation orders. To turn them off, set the environment variable TF_ENABLE_ONEDNN_OPTS=0.</w:t>
+      </w:r>
+      <w:r>
+        <w:br/>
+        <w:t xml:space="preserve">WARNING: All log messages before </w:t>
+      </w:r>
+      <w:proofErr w:type="spellStart"/>
+      <w:proofErr w:type="gramStart"/>
+      <w:r>
+        <w:t>absl</w:t>
+      </w:r>
+      <w:proofErr w:type="spellEnd"/>
+      <w:r>
+        <w:t>::</w:t>
+      </w:r>
+      <w:proofErr w:type="spellStart"/>
+      <w:r>
+        <w:t>InitializeLog</w:t>
+      </w:r>
+      <w:proofErr w:type="spellEnd"/>
+      <w:r>
+        <w:t>(</w:t>
+      </w:r>
+      <w:proofErr w:type="gramEnd"/>
+      <w:r>
+        <w:t>) is called are written to STDERR</w:t>
+      </w:r>
+      <w:r>
+        <w:br/>
+        <w:t xml:space="preserve">I0000 00:00:1791603427.906112 13052 port.cc:153] </w:t>
+      </w:r>
+      <w:proofErr w:type="spellStart"/>
+      <w:r>
+        <w:t>oneDNN</w:t>
+      </w:r>
+      <w:proofErr w:type="spellEnd"/>
+      <w:r>
+        <w:t xml:space="preserve"> custom operations are on. You may see slightly different numerical results due to floating-point round-off errors from different computation orders. To turn them off, set the environment variable TF_ENABLE_ONEDNN_OPTS=0.</w:t>
+      </w:r>
+      <w:r>
+        <w:br/>
+        <w:t>Traceback (most recent call last):</w:t>
+      </w:r>
+      <w:r>
+        <w:br/>
+        <w:t>File "C:\Users\gianc\Documents\faculdade\ic\HikeFlora\avaliar_teste.py", line 7, in &lt;module&gt;</w:t>
+      </w:r>
+      <w:r>
+        <w:br/>
+        <w:t xml:space="preserve">from </w:t>
+      </w:r>
+      <w:proofErr w:type="spellStart"/>
+      <w:r>
+        <w:t>sklearn.metrics</w:t>
+      </w:r>
+      <w:proofErr w:type="spellEnd"/>
+      <w:r>
+        <w:t xml:space="preserve"> import </w:t>
+      </w:r>
+      <w:proofErr w:type="spellStart"/>
+      <w:r>
+        <w:t>accuracy_score</w:t>
+      </w:r>
+      <w:proofErr w:type="spellEnd"/>
+      <w:r>
+        <w:t xml:space="preserve">, </w:t>
+      </w:r>
+      <w:proofErr w:type="spellStart"/>
+      <w:r>
+        <w:t>confusion_matrix</w:t>
+      </w:r>
+      <w:proofErr w:type="spellEnd"/>
+      <w:r>
+        <w:t xml:space="preserve">, f1_score, </w:t>
+      </w:r>
+      <w:proofErr w:type="spellStart"/>
+      <w:r>
+        <w:t>recall_score</w:t>
+      </w:r>
+      <w:proofErr w:type="spellEnd"/>
+      <w:r>
+        <w:t xml:space="preserve">, </w:t>
+      </w:r>
+      <w:proofErr w:type="spellStart"/>
+      <w:r>
+        <w:t>roc_auc_score</w:t>
+      </w:r>
+      <w:proofErr w:type="spellEnd"/>
+      <w:r>
+        <w:br/>
+        <w:t>File "C:\Users\gianc\hfvenv\Lib\site-packages\sklearn_</w:t>
+      </w:r>
+      <w:r>
+        <w:rPr>
+          <w:i/>
+          <w:iCs/>
+        </w:rPr>
+        <w:t>init</w:t>
+      </w:r>
+      <w:r>
+        <w:t>_.py", line 70, in &lt;module&gt;</w:t>
+      </w:r>
+      <w:r>
+        <w:br/>
+        <w:t xml:space="preserve">from </w:t>
+      </w:r>
+      <w:proofErr w:type="spellStart"/>
+      <w:r>
+        <w:t>sklearn.base</w:t>
+      </w:r>
+      <w:proofErr w:type="spellEnd"/>
+      <w:r>
+        <w:t xml:space="preserve"> import clone # </w:t>
+      </w:r>
+      <w:proofErr w:type="spellStart"/>
+      <w:r>
+        <w:t>noqa</w:t>
+      </w:r>
+      <w:proofErr w:type="spellEnd"/>
+      <w:r>
+        <w:t>: E402</w:t>
+      </w:r>
+      <w:r>
+        <w:br/>
+        <w:t>^^^^^^^^^^^^^^^^^^^^^^^^^^^^^^</w:t>
+      </w:r>
+      <w:r>
+        <w:br/>
+        <w:t>File "C:\Users\gianc\hfvenv\Lib\site-packages\sklearn\base.py", line 21, in &lt;module&gt;</w:t>
+      </w:r>
+      <w:r>
+        <w:br/>
+        <w:t xml:space="preserve">from </w:t>
+      </w:r>
+      <w:proofErr w:type="spellStart"/>
+      <w:r>
+        <w:t>sklearn.utils.</w:t>
+      </w:r>
+      <w:r>
+        <w:rPr>
+          <w:i/>
+          <w:iCs/>
+        </w:rPr>
+        <w:t>missing</w:t>
+      </w:r>
+      <w:proofErr w:type="spellEnd"/>
+      <w:r>
+        <w:rPr>
+          <w:i/>
+          <w:iCs/>
+        </w:rPr>
+        <w:t xml:space="preserve"> import </w:t>
+      </w:r>
+      <w:proofErr w:type="spellStart"/>
+      <w:r>
+        <w:rPr>
+          <w:i/>
+          <w:iCs/>
+        </w:rPr>
+        <w:t>is_pandas_na</w:t>
+      </w:r>
+      <w:proofErr w:type="spellEnd"/>
+      <w:r>
+        <w:rPr>
+          <w:i/>
+          <w:iCs/>
+        </w:rPr>
+        <w:t xml:space="preserve">, </w:t>
+      </w:r>
+      <w:proofErr w:type="spellStart"/>
+      <w:r>
+        <w:rPr>
+          <w:i/>
+          <w:iCs/>
+        </w:rPr>
+        <w:t>is_scalar_nan</w:t>
+      </w:r>
+      <w:proofErr w:type="spellEnd"/>
+      <w:r>
+        <w:rPr>
+          <w:i/>
+          <w:iCs/>
+        </w:rPr>
+        <w:br/>
+        <w:t>File "C:\Users\gianc\hfvenv\Lib\site-packages\sklearn\utils_init</w:t>
+      </w:r>
+      <w:r>
+        <w:t>.py", line 9, in &lt;module&gt;</w:t>
+      </w:r>
+      <w:r>
+        <w:br/>
+      </w:r>
+      <w:r>
+        <w:lastRenderedPageBreak/>
+        <w:t xml:space="preserve">from </w:t>
+      </w:r>
+      <w:proofErr w:type="spellStart"/>
+      <w:r>
+        <w:t>sklearn.utils._chunking</w:t>
+      </w:r>
+      <w:proofErr w:type="spellEnd"/>
+      <w:r>
+        <w:t xml:space="preserve"> import </w:t>
+      </w:r>
+      <w:proofErr w:type="spellStart"/>
+      <w:r>
+        <w:t>gen_batches</w:t>
+      </w:r>
+      <w:proofErr w:type="spellEnd"/>
+      <w:r>
+        <w:t xml:space="preserve">, </w:t>
+      </w:r>
+      <w:proofErr w:type="spellStart"/>
+      <w:r>
+        <w:t>gen_even_slices</w:t>
+      </w:r>
+      <w:proofErr w:type="spellEnd"/>
+      <w:r>
+        <w:br/>
+        <w:t>File "C:\Users\gianc\hfvenv\Lib\site-packages\sklearn\utils_chunking.py", line 11, in &lt;module&gt;</w:t>
+      </w:r>
+      <w:r>
+        <w:br/>
+        <w:t>from sklearn.utils._</w:t>
+      </w:r>
+      <w:proofErr w:type="spellStart"/>
+      <w:r>
+        <w:t>param_validation</w:t>
+      </w:r>
+      <w:proofErr w:type="spellEnd"/>
+      <w:r>
+        <w:t xml:space="preserve"> import Interval, </w:t>
+      </w:r>
+      <w:proofErr w:type="spellStart"/>
+      <w:r>
+        <w:t>validate_params</w:t>
+      </w:r>
+      <w:proofErr w:type="spellEnd"/>
+      <w:r>
+        <w:br/>
+        <w:t>File "C:\Users\gianc\hfvenv\Lib\site-packages\sklearn\utils_param_validation.py", line 17, in &lt;module&gt;</w:t>
+      </w:r>
+      <w:r>
+        <w:br/>
+        <w:t xml:space="preserve">from </w:t>
+      </w:r>
+      <w:proofErr w:type="spellStart"/>
+      <w:r>
+        <w:t>sklearn.utils.validation</w:t>
+      </w:r>
+      <w:proofErr w:type="spellEnd"/>
+      <w:r>
+        <w:t xml:space="preserve"> import _</w:t>
+      </w:r>
+      <w:proofErr w:type="spellStart"/>
+      <w:r>
+        <w:t>is_arraylike_not_scalar</w:t>
+      </w:r>
+      <w:proofErr w:type="spellEnd"/>
+      <w:r>
+        <w:br/>
+        <w:t>File "C:\Users\gianc\hfvenv\Lib\site-packages\sklearn\utils\validation.py", line 33, in &lt;module&gt;</w:t>
+      </w:r>
+      <w:r>
+        <w:br/>
+        <w:t>from sklearn.utils._</w:t>
+      </w:r>
+      <w:proofErr w:type="spellStart"/>
+      <w:r>
+        <w:t>isfinite</w:t>
+      </w:r>
+      <w:proofErr w:type="spellEnd"/>
+      <w:r>
+        <w:t xml:space="preserve"> import </w:t>
+      </w:r>
+      <w:proofErr w:type="spellStart"/>
+      <w:r>
+        <w:t>FiniteStatus</w:t>
+      </w:r>
+      <w:proofErr w:type="spellEnd"/>
+      <w:r>
+        <w:t xml:space="preserve">, </w:t>
+      </w:r>
+      <w:proofErr w:type="spellStart"/>
+      <w:r>
+        <w:t>cy_isfinite</w:t>
+      </w:r>
+      <w:proofErr w:type="spellEnd"/>
+      <w:r>
+        <w:br/>
+      </w:r>
+      <w:proofErr w:type="spellStart"/>
+      <w:r>
+        <w:t>ImportError</w:t>
+      </w:r>
+      <w:proofErr w:type="spellEnd"/>
+      <w:r>
+        <w:t>: DLL load failed while importing _</w:t>
+      </w:r>
+      <w:proofErr w:type="spellStart"/>
+      <w:r>
+        <w:t>isfinite</w:t>
+      </w:r>
+      <w:proofErr w:type="spellEnd"/>
+      <w:r>
+        <w:t>: An Application Control policy has blocked this file.</w:t>
+      </w:r>
+    </w:p>
+    <w:p>
+      <w:pPr>
+        <w:rPr>
+          <w:lang w:val="pt-BR"/>
+        </w:rPr>
+      </w:pPr>
+      <w:r>
+        <w:rPr>
+          <w:lang w:val="pt-BR"/>
+        </w:rPr>
+        <w:br/>
+      </w:r>
+      <w:r>
+        <w:rPr>
+          <w:lang w:val="pt-BR"/>
+        </w:rPr>
+        <w:br/>
+        <w:t xml:space="preserve">Resposta: </w:t>
+      </w:r>
+      <w:r>
+        <w:rPr>
+          <w:lang w:val="pt-BR"/>
+        </w:rPr>
+        <w:t>A avaliação independente não iniciou porque uma política de controlo de aplicações do Windows bloqueou um componente binário do scikit-learn. Foi preparada uma correção que calcula as mesmas métricas com NumPy, sem essa dependência, mantendo o formato do resultado. Os cálculos foram conferidos com valores de referência antes de repetir a avaliação no conjunto de teste.</w:t>
+      </w:r>
+      <w:r>
+        <w:rPr>
+          <w:lang w:val="pt-BR"/>
+        </w:rPr>
+        <w:br/>
+      </w:r>
+      <w:r>
+        <w:rPr>
+          <w:lang w:val="pt-BR"/>
+        </w:rPr>
+        <w:br/>
+        <w:t>Prompt: resultados...</w:t>
+      </w:r>
+      <w:r>
+        <w:rPr>
+          <w:lang w:val="pt-BR"/>
+        </w:rPr>
+        <w:br/>
+      </w:r>
+      <w:r>
+        <w:rPr>
+          <w:lang w:val="pt-BR"/>
+        </w:rPr>
+        <w:br/>
+        <w:t>Reposta:</w:t>
+      </w:r>
+      <w:r>
+        <w:rPr>
+          <w:lang w:val="pt-BR"/>
+        </w:rPr>
+        <w:br/>
+      </w:r>
+      <w:r>
+        <w:rPr>
+          <w:lang w:val="pt-BR"/>
+        </w:rPr>
+        <w:t>Foram analisados os resultados de teste independente de 1 100 imagens, com 220 por espécie. A CNN com dropout superou a MLP em todas as métricas globais: obteve 74,00% de accuracy e 74,25% de F1 macro, contra 47,55% e 45,28% da MLP. As matrizes de confusão revelaram uma forte tendência da MLP para prever trevo-branco e, na CNN, erros sobretudo entre trevo-branco e morangueiro. O teste conclui a comparação dos classificadores neste dataset; os resultados devem agora ser integrados e discutidos no relatório.</w:t>
       </w:r>
     </w:p>
     <w:sectPr>

</xml_diff>